<commit_message>
Updated my CV and portfolio details
</commit_message>
<xml_diff>
--- a/Shervin Shafizad Curriculum Vitea-converted.docx
+++ b/Shervin Shafizad Curriculum Vitea-converted.docx
@@ -5987,7 +5987,7 @@
           </mc:Choice>
           <mc:Fallback>
             <w:pict>
-              <v:group w14:anchorId="42429BA9" id="Group 1" o:spid="_x0000_s1026" style="position:absolute;margin-left:-.7pt;margin-top:0;width:595.25pt;height:841.9pt;z-index:-251659776;mso-wrap-distance-left:0;mso-wrap-distance-right:0;mso-position-horizontal-relative:page;mso-position-vertical-relative:page" coordsize="75600,106923" o:gfxdata="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">
+              <v:group w14:anchorId="4B357048" id="Group 1" o:spid="_x0000_s1026" style="position:absolute;margin-left:-.7pt;margin-top:0;width:595.25pt;height:841.9pt;z-index:-251659776;mso-wrap-distance-left:0;mso-wrap-distance-right:0;mso-position-horizontal-relative:page;mso-position-vertical-relative:page" coordsize="75600,106923" o:gfxdata="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">
                 <v:shape id="Graphic 2" o:spid="_x0000_s1027" style="position:absolute;left:50505;top:20314;width:25095;height:86500;visibility:visible;mso-wrap-style:square;v-text-anchor:top" coordsize="2509520,8649970" o:gfxdata="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" path="m2509392,l,,,8649589r2509392,l2509392,xe" fillcolor="#ff7707" stroked="f">
                   <v:path arrowok="t"/>
                 </v:shape>
@@ -6586,15 +6586,6 @@
       </w:r>
       <w:r>
         <w:t xml:space="preserve">Iran </w:t>
-      </w:r>
-    </w:p>
-    <w:p>
-      <w:pPr>
-        <w:pStyle w:val="BodyText"/>
-        <w:ind w:right="1543"/>
-      </w:pPr>
-      <w:r>
-        <w:t>Nationality: Iranian</w:t>
       </w:r>
     </w:p>
     <w:p>
@@ -7143,7 +7134,21 @@
           <w:b/>
           <w:bCs/>
         </w:rPr>
-        <w:t>mobile, web, VR)</w:t>
+        <w:t xml:space="preserve">mobile, </w:t>
+      </w:r>
+      <w:r>
+        <w:rPr>
+          <w:b/>
+          <w:bCs/>
+        </w:rPr>
+        <w:t>pc</w:t>
+      </w:r>
+      <w:r>
+        <w:rPr>
+          <w:b/>
+          <w:bCs/>
+        </w:rPr>
+        <w:t>, VR)</w:t>
       </w:r>
     </w:p>
     <w:p>
@@ -7187,7 +7192,13 @@
         </w:rPr>
       </w:pPr>
       <w:r>
-        <w:t>Familiar with various software</w:t>
+        <w:t xml:space="preserve">Familiar with </w:t>
+      </w:r>
+      <w:r>
+        <w:t>different</w:t>
+      </w:r>
+      <w:r>
+        <w:t xml:space="preserve"> software</w:t>
       </w:r>
       <w:r>
         <w:t xml:space="preserve"> </w:t>
@@ -7203,7 +7214,14 @@
           <w:b/>
           <w:bCs/>
         </w:rPr>
-        <w:t xml:space="preserve">Photo shop, Maya, Blender, Unreal Engine, etc. </w:t>
+        <w:t>Photo shop, Maya</w:t>
+      </w:r>
+      <w:r>
+        <w:rPr>
+          <w:b/>
+          <w:bCs/>
+        </w:rPr>
+        <w:t xml:space="preserve">, etc. </w:t>
       </w:r>
     </w:p>
     <w:p>
@@ -7245,35 +7263,88 @@
         <w:t>(both solo and team projects).</w:t>
       </w:r>
     </w:p>
+    <w:p/>
     <w:p>
-      <w:r>
-        <w:t xml:space="preserve">More than </w:t>
-      </w:r>
-      <w:r>
-        <w:t>4 years of experience in game development (</w:t>
-      </w:r>
       <w:r>
         <w:rPr>
           <w:b/>
           <w:bCs/>
         </w:rPr>
-        <w:t>see my portfolio and projects website</w:t>
-      </w:r>
-      <w:r>
-        <w:t>)</w:t>
+        <w:t xml:space="preserve">More than </w:t>
+      </w:r>
+      <w:r>
+        <w:rPr>
+          <w:b/>
+          <w:bCs/>
+        </w:rPr>
+        <w:t xml:space="preserve">4 </w:t>
+      </w:r>
+      <w:r>
+        <w:rPr>
+          <w:b/>
+          <w:bCs/>
+        </w:rPr>
+        <w:t xml:space="preserve">years of experience </w:t>
+      </w:r>
+      <w:r>
+        <w:t>with</w:t>
+      </w:r>
+      <w:r>
+        <w:t xml:space="preserve"> </w:t>
+      </w:r>
+      <w:r>
+        <w:t>Unity Game</w:t>
+      </w:r>
+      <w:r>
+        <w:t xml:space="preserve"> </w:t>
+      </w:r>
+      <w:r>
+        <w:t>Engine</w:t>
+      </w:r>
+      <w:r>
+        <w:t xml:space="preserve"> </w:t>
+      </w:r>
+      <w:r>
+        <w:t>(see my portfolio and projects website)</w:t>
       </w:r>
       <w:r>
         <w:t>.</w:t>
+      </w:r>
+    </w:p>
+    <w:p/>
+    <w:p>
+      <w:r>
+        <w:rPr>
+          <w:b/>
+          <w:bCs/>
+        </w:rPr>
+        <w:t>Four months of experience</w:t>
+      </w:r>
+      <w:r>
+        <w:rPr>
+          <w:b/>
+          <w:bCs/>
+        </w:rPr>
+        <w:t xml:space="preserve"> as a coding intern</w:t>
+      </w:r>
+      <w:r>
+        <w:t xml:space="preserve"> inside a Berlin based Company</w:t>
+      </w:r>
+      <w:r>
+        <w:t xml:space="preserve"> named “</w:t>
+      </w:r>
+      <w:proofErr w:type="spellStart"/>
+      <w:r>
+        <w:t>Thoughtfish</w:t>
+      </w:r>
+      <w:proofErr w:type="spellEnd"/>
+      <w:r>
+        <w:t xml:space="preserve"> GmbH”.</w:t>
       </w:r>
     </w:p>
     <w:p/>
     <w:p/>
     <w:p/>
-    <w:p/>
-    <w:p>
-      <w:bookmarkStart w:id="0" w:name="_GoBack"/>
-      <w:bookmarkEnd w:id="0"/>
-    </w:p>
     <w:p>
       <w:pPr>
         <w:rPr>
@@ -7297,12 +7368,8 @@
         </w:rPr>
         <w:t xml:space="preserve">  </w:t>
       </w:r>
-    </w:p>
-    <w:p>
-      <w:pPr>
-        <w:pStyle w:val="Heading1"/>
-        <w:ind w:left="0"/>
-      </w:pPr>
+      <w:bookmarkStart w:id="0" w:name="_GoBack"/>
+      <w:bookmarkEnd w:id="0"/>
       <w:r>
         <w:rPr>
           <w:color w:val="1F2B6A"/>
@@ -7587,7 +7654,16 @@
             <w:spacing w:val="-2"/>
             <w:sz w:val="20"/>
           </w:rPr>
-          <w:t>Linked in account</w:t>
+          <w:t>Linked-</w:t>
+        </w:r>
+        <w:r>
+          <w:rPr>
+            <w:rStyle w:val="Hyperlink"/>
+            <w:b/>
+            <w:spacing w:val="-2"/>
+            <w:sz w:val="20"/>
+          </w:rPr>
+          <w:t>in account</w:t>
         </w:r>
       </w:hyperlink>
       <w:r>

</xml_diff>